<commit_message>
VO page: the VO-AI assessment card goes
Its useful parts stay where they are used: the elements a change like
this usually also needs measured sit under the measurement table, and
the standard clause's wording and required evidence fold under the
contract agent's check. The rest (classification, totals, findings,
the contract reading) is already shown by the step card, the
measurement table and the contract tab. The proposal update's test
questions 2 and 3 point to the new places.

Co-Authored-By: Claude Opus 5.5 <noreply@anthropic.com>
Claude-Session: https://claude.ai/code/session_012XBrNu6LUdAuht2UEA4XnX
</commit_message>
<xml_diff>
--- a/docs/proposal/proposal-zh-update-2026-10.docx
+++ b/docs/proposal/proposal-zh-update-2026-10.docx
@@ -1451,7 +1451,7 @@
         <w:t xml:space="preserve"> </w:t>
       </w:r>
       <w:r>
-        <w:t xml:space="preserve">在 VO-001 的「计量」标签中查看「VO-AI 评估」的「检测到的建筑元素」。系统识别受影响的工程元素为地面饰面，并提示确认</w:t>
+        <w:t xml:space="preserve">在 VO-001 的「计量」标签中，查看计量表下方的「检测到的建筑元素」。系统识别受影响的工程元素为地面饰面，并提示确认</w:t>
       </w:r>
       <w:r>
         <w:t xml:space="preserve"> </w:t>
@@ -1501,7 +1501,7 @@
         <w:t xml:space="preserve"> </w:t>
       </w:r>
       <w:r>
-        <w:t xml:space="preserve">在任何一个变更单的「合同」标签中查看合同智能体的检查结果，或在「计量」标签的「VO-AI 评估」中展开适用条款。系统返回 PAM 2018 第 11.1 条（变更的定义）、该条款赋予的权利，以及所需的证明资料：书面建筑师指示、被取代及修订的图纸，以及列明删减与增加内容的计量。条文以中文显示，下方可展开「英文原文」。当描述过于模糊而无法分类时，系统会明确说明，并要求补充说明，而不会给出没有依据的条款。</w:t>
+        <w:t xml:space="preserve">在任何一个变更单的「合同」标签中查看合同智能体的检查结果，并展开下方的「变更的定义：条文内容与所需证明」。系统返回 PAM 2018 第 11.1 条（变更的定义）、该条款赋予的权利，以及所需的证明资料：书面建筑师指示、被取代及修订的图纸，以及列明删减与增加内容的计量。条文以中文显示，下方可展开「英文原文」。当描述过于模糊而无法分类时，系统会明确说明，并要求补充说明，而不会给出没有依据的条款。</w:t>
       </w:r>
     </w:p>
     <w:p>

</xml_diff>